<commit_message>
feat: update settings with new Bash permissions and add presentation files for team
</commit_message>
<xml_diff>
--- a/08_GOBERNANZA/Presentacion ENS equipo optimTech.docx
+++ b/08_GOBERNANZA/Presentacion ENS equipo optimTech.docx
@@ -374,6 +374,116 @@
           </w:p>
         </w:tc>
       </w:tr>
+      <w:tr>
+        <w:tc>
+          <w:tcPr>
+            <w:tcW w:type="dxa" w:w="1800"/>
+            <w:tcBorders>
+              <w:top w:val="single" w:color="D9D9D9" w:sz="1"/>
+              <w:left w:val="single" w:color="D9D9D9" w:sz="1"/>
+              <w:bottom w:val="single" w:color="D9D9D9" w:sz="1"/>
+              <w:right w:val="single" w:color="D9D9D9" w:sz="1"/>
+            </w:tcBorders>
+            <w:vAlign w:val="center"/>
+          </w:tcPr>
+          <w:p>
+            <w:pPr>
+              <w:spacing w:before="40" w:after="40"/>
+            </w:pPr>
+            <w:r>
+              <w:rPr>
+                <w:rFonts w:ascii="Calibri" w:cs="Calibri" w:eastAsia="Calibri" w:hAnsi="Calibri"/>
+                <w:b w:val="false"/>
+                <w:bCs w:val="false"/>
+                <w:sz w:val="22"/>
+                <w:szCs w:val="22"/>
+              </w:rPr>
+              <w:t xml:space="preserve">08/03/2026</w:t>
+            </w:r>
+          </w:p>
+        </w:tc>
+        <w:tc>
+          <w:tcPr>
+            <w:tcW w:type="dxa" w:w="1800"/>
+            <w:tcBorders>
+              <w:top w:val="single" w:color="D9D9D9" w:sz="1"/>
+              <w:left w:val="single" w:color="D9D9D9" w:sz="1"/>
+              <w:bottom w:val="single" w:color="D9D9D9" w:sz="1"/>
+              <w:right w:val="single" w:color="D9D9D9" w:sz="1"/>
+            </w:tcBorders>
+            <w:vAlign w:val="center"/>
+          </w:tcPr>
+          <w:p>
+            <w:pPr>
+              <w:spacing w:before="40" w:after="40"/>
+            </w:pPr>
+            <w:r>
+              <w:rPr>
+                <w:rFonts w:ascii="Calibri" w:cs="Calibri" w:eastAsia="Calibri" w:hAnsi="Calibri"/>
+                <w:b w:val="false"/>
+                <w:bCs w:val="false"/>
+                <w:sz w:val="22"/>
+                <w:szCs w:val="22"/>
+              </w:rPr>
+              <w:t xml:space="preserve">1.1</w:t>
+            </w:r>
+          </w:p>
+        </w:tc>
+        <w:tc>
+          <w:tcPr>
+            <w:tcW w:type="dxa" w:w="4400"/>
+            <w:tcBorders>
+              <w:top w:val="single" w:color="D9D9D9" w:sz="1"/>
+              <w:left w:val="single" w:color="D9D9D9" w:sz="1"/>
+              <w:bottom w:val="single" w:color="D9D9D9" w:sz="1"/>
+              <w:right w:val="single" w:color="D9D9D9" w:sz="1"/>
+            </w:tcBorders>
+            <w:vAlign w:val="center"/>
+          </w:tcPr>
+          <w:p>
+            <w:pPr>
+              <w:spacing w:before="40" w:after="40"/>
+            </w:pPr>
+            <w:r>
+              <w:rPr>
+                <w:rFonts w:ascii="Calibri" w:cs="Calibri" w:eastAsia="Calibri" w:hAnsi="Calibri"/>
+                <w:b w:val="false"/>
+                <w:bCs w:val="false"/>
+                <w:sz w:val="22"/>
+                <w:szCs w:val="22"/>
+              </w:rPr>
+              <w:t xml:space="preserve">Nueva diapositiva 15: RAT (D11) y herramientas de Marketing</w:t>
+            </w:r>
+          </w:p>
+        </w:tc>
+        <w:tc>
+          <w:tcPr>
+            <w:tcW w:type="dxa" w:w="1500"/>
+            <w:tcBorders>
+              <w:top w:val="single" w:color="D9D9D9" w:sz="1"/>
+              <w:left w:val="single" w:color="D9D9D9" w:sz="1"/>
+              <w:bottom w:val="single" w:color="D9D9D9" w:sz="1"/>
+              <w:right w:val="single" w:color="D9D9D9" w:sz="1"/>
+            </w:tcBorders>
+            <w:vAlign w:val="center"/>
+          </w:tcPr>
+          <w:p>
+            <w:pPr>
+              <w:spacing w:before="40" w:after="40"/>
+            </w:pPr>
+            <w:r>
+              <w:rPr>
+                <w:rFonts w:ascii="Calibri" w:cs="Calibri" w:eastAsia="Calibri" w:hAnsi="Calibri"/>
+                <w:b w:val="false"/>
+                <w:bCs w:val="false"/>
+                <w:sz w:val="22"/>
+                <w:szCs w:val="22"/>
+              </w:rPr>
+              <w:t xml:space="preserve">CTO</w:t>
+            </w:r>
+          </w:p>
+        </w:tc>
+      </w:tr>
     </w:tbl>
     <w:p>
       <w:r>
@@ -3018,7 +3128,272 @@
           <w:sz w:val="32"/>
           <w:szCs w:val="32"/>
         </w:rPr>
-        <w:t xml:space="preserve">Diapositiva 15: Escenarios — Que Hago Si...?</w:t>
+        <w:t xml:space="preserve">Diapositiva 15: Nuevas Herramientas = Nuevo Tratamiento de Datos</w:t>
+      </w:r>
+    </w:p>
+    <w:p>
+      <w:pPr>
+        <w:spacing w:before="200" w:after="100"/>
+      </w:pPr>
+      <w:r>
+        <w:rPr>
+          <w:rFonts w:ascii="Calibri" w:cs="Calibri" w:eastAsia="Calibri" w:hAnsi="Calibri"/>
+          <w:color w:val="0D9A76"/>
+          <w:sz w:val="26"/>
+          <w:szCs w:val="26"/>
+        </w:rPr>
+        <w:t xml:space="preserve">Contenido de la Diapositiva</w:t>
+      </w:r>
+    </w:p>
+    <w:p>
+      <w:pPr>
+        <w:spacing w:after="120"/>
+      </w:pPr>
+      <w:r>
+        <w:rPr>
+          <w:rFonts w:ascii="Calibri" w:cs="Calibri" w:eastAsia="Calibri" w:hAnsi="Calibri"/>
+          <w:b/>
+          <w:bCs/>
+          <w:sz w:val="22"/>
+          <w:szCs w:val="22"/>
+        </w:rPr>
+        <w:t xml:space="preserve">Cuando actualizar el RAT (D11):</w:t>
+      </w:r>
+    </w:p>
+    <w:p>
+      <w:pPr>
+        <w:pStyle w:val="ListParagraph"/>
+        <w:numPr>
+          <w:ilvl w:val="0"/>
+          <w:numId w:val="2"/>
+        </w:numPr>
+        <w:spacing w:after="80"/>
+      </w:pPr>
+      <w:r>
+        <w:rPr>
+          <w:rFonts w:ascii="Calibri" w:cs="Calibri" w:eastAsia="Calibri" w:hAnsi="Calibri"/>
+          <w:sz w:val="22"/>
+          <w:szCs w:val="22"/>
+        </w:rPr>
+        <w:t xml:space="preserve">Nueva herramienta que trata datos personales (HubSpot, LinkedIn Ads, Mailchimp...).</w:t>
+      </w:r>
+    </w:p>
+    <w:p>
+      <w:pPr>
+        <w:pStyle w:val="ListParagraph"/>
+        <w:numPr>
+          <w:ilvl w:val="0"/>
+          <w:numId w:val="2"/>
+        </w:numPr>
+        <w:spacing w:after="80"/>
+      </w:pPr>
+      <w:r>
+        <w:rPr>
+          <w:rFonts w:ascii="Calibri" w:cs="Calibri" w:eastAsia="Calibri" w:hAnsi="Calibri"/>
+          <w:sz w:val="22"/>
+          <w:szCs w:val="22"/>
+        </w:rPr>
+        <w:t xml:space="preserve">Nueva actividad de tratamiento no cubierta en el registro actual.</w:t>
+      </w:r>
+    </w:p>
+    <w:p>
+      <w:pPr>
+        <w:pStyle w:val="ListParagraph"/>
+        <w:numPr>
+          <w:ilvl w:val="0"/>
+          <w:numId w:val="2"/>
+        </w:numPr>
+        <w:spacing w:after="80"/>
+      </w:pPr>
+      <w:r>
+        <w:rPr>
+          <w:rFonts w:ascii="Calibri" w:cs="Calibri" w:eastAsia="Calibri" w:hAnsi="Calibri"/>
+          <w:sz w:val="22"/>
+          <w:szCs w:val="22"/>
+        </w:rPr>
+        <w:t xml:space="preserve">Nuevo proveedor con acceso a datos personales.</w:t>
+      </w:r>
+    </w:p>
+    <w:p>
+      <w:pPr>
+        <w:pStyle w:val="ListParagraph"/>
+        <w:numPr>
+          <w:ilvl w:val="0"/>
+          <w:numId w:val="2"/>
+        </w:numPr>
+        <w:spacing w:after="80"/>
+      </w:pPr>
+      <w:r>
+        <w:rPr>
+          <w:rFonts w:ascii="Calibri" w:cs="Calibri" w:eastAsia="Calibri" w:hAnsi="Calibri"/>
+          <w:sz w:val="22"/>
+          <w:szCs w:val="22"/>
+        </w:rPr>
+        <w:t xml:space="preserve">Cambio en la finalidad del tratamiento existente.</w:t>
+      </w:r>
+    </w:p>
+    <w:p>
+      <w:pPr>
+        <w:spacing w:before="120" w:after="120"/>
+      </w:pPr>
+      <w:r>
+        <w:rPr>
+          <w:rFonts w:ascii="Calibri" w:cs="Calibri" w:eastAsia="Calibri" w:hAnsi="Calibri"/>
+          <w:b/>
+          <w:bCs/>
+          <w:sz w:val="22"/>
+          <w:szCs w:val="22"/>
+        </w:rPr>
+        <w:t xml:space="preserve">Como notificarlo:</w:t>
+      </w:r>
+    </w:p>
+    <w:p>
+      <w:pPr>
+        <w:pStyle w:val="ListParagraph"/>
+        <w:numPr>
+          <w:ilvl w:val="0"/>
+          <w:numId w:val="2"/>
+        </w:numPr>
+        <w:spacing w:after="80"/>
+      </w:pPr>
+      <w:r>
+        <w:rPr>
+          <w:rFonts w:ascii="Calibri" w:cs="Calibri" w:eastAsia="Calibri" w:hAnsi="Calibri"/>
+          <w:sz w:val="22"/>
+          <w:szCs w:val="22"/>
+        </w:rPr>
+        <w:t xml:space="preserve">Opcion 1: Crear ticket en Jira Service Management (tipo: “Solicitud de cambio ENS”).</w:t>
+      </w:r>
+    </w:p>
+    <w:p>
+      <w:pPr>
+        <w:pStyle w:val="ListParagraph"/>
+        <w:numPr>
+          <w:ilvl w:val="0"/>
+          <w:numId w:val="2"/>
+        </w:numPr>
+        <w:spacing w:after="80"/>
+      </w:pPr>
+      <w:r>
+        <w:rPr>
+          <w:rFonts w:ascii="Calibri" w:cs="Calibri" w:eastAsia="Calibri" w:hAnsi="Calibri"/>
+          <w:sz w:val="22"/>
+          <w:szCs w:val="22"/>
+        </w:rPr>
+        <w:t xml:space="preserve">Opcion 2: Contactar directamente al DPO o al Responsable de Seguridad.</w:t>
+      </w:r>
+    </w:p>
+    <w:p>
+      <w:pPr>
+        <w:pStyle w:val="ListParagraph"/>
+        <w:numPr>
+          <w:ilvl w:val="0"/>
+          <w:numId w:val="2"/>
+        </w:numPr>
+        <w:spacing w:after="80"/>
+      </w:pPr>
+      <w:r>
+        <w:rPr>
+          <w:rFonts w:ascii="Calibri" w:cs="Calibri" w:eastAsia="Calibri" w:hAnsi="Calibri"/>
+          <w:b/>
+          <w:bCs/>
+          <w:sz w:val="22"/>
+          <w:szCs w:val="22"/>
+        </w:rPr>
+        <w:t xml:space="preserve">Obligatorio ANTES de empezar a usar la herramienta.</w:t>
+      </w:r>
+    </w:p>
+    <w:p>
+      <w:pPr>
+        <w:pStyle w:val="ListParagraph"/>
+        <w:numPr>
+          <w:ilvl w:val="0"/>
+          <w:numId w:val="2"/>
+        </w:numPr>
+        <w:spacing w:after="80"/>
+      </w:pPr>
+      <w:r>
+        <w:rPr>
+          <w:rFonts w:ascii="Calibri" w:cs="Calibri" w:eastAsia="Calibri" w:hAnsi="Calibri"/>
+          <w:sz w:val="22"/>
+          <w:szCs w:val="22"/>
+        </w:rPr>
+        <w:t xml:space="preserve">El DPO evaluara si requiere EIPD (Evaluacion de Impacto en Proteccion de Datos).</w:t>
+      </w:r>
+    </w:p>
+    <w:p>
+      <w:pPr>
+        <w:spacing w:before="200" w:after="100"/>
+      </w:pPr>
+      <w:r>
+        <w:rPr>
+          <w:rFonts w:ascii="Calibri" w:cs="Calibri" w:eastAsia="Calibri" w:hAnsi="Calibri"/>
+          <w:color w:val="0D9A76"/>
+          <w:sz w:val="26"/>
+          <w:szCs w:val="26"/>
+        </w:rPr>
+        <w:t xml:space="preserve">Notas del Presentador</w:t>
+      </w:r>
+    </w:p>
+    <w:p>
+      <w:pPr>
+        <w:spacing w:after="120"/>
+      </w:pPr>
+      <w:r>
+        <w:rPr>
+          <w:rFonts w:ascii="Calibri" w:cs="Calibri" w:eastAsia="Calibri" w:hAnsi="Calibri"/>
+          <w:sz w:val="22"/>
+          <w:szCs w:val="22"/>
+        </w:rPr>
+        <w:t xml:space="preserve">Marketing va a incorporar herramientas como HubSpot, LinkedIn y plataformas de email marketing. Todas estas herramientas tratan datos personales y requieren actualizar el RAT (D11). Es importante que ANTES de empezar a usar cualquier herramienta nueva, se notifique para evaluar el impacto en proteccion de datos y actualizar la documentacion ENS.</w:t>
+      </w:r>
+    </w:p>
+    <w:p>
+      <w:pPr>
+        <w:spacing w:before="200" w:after="100"/>
+      </w:pPr>
+      <w:r>
+        <w:rPr>
+          <w:rFonts w:ascii="Calibri" w:cs="Calibri" w:eastAsia="Calibri" w:hAnsi="Calibri"/>
+          <w:color w:val="0D9A76"/>
+          <w:sz w:val="26"/>
+          <w:szCs w:val="26"/>
+        </w:rPr>
+        <w:t xml:space="preserve">Tiempo Estimado</w:t>
+      </w:r>
+    </w:p>
+    <w:p>
+      <w:pPr>
+        <w:spacing w:after="120"/>
+      </w:pPr>
+      <w:r>
+        <w:rPr>
+          <w:rFonts w:ascii="Calibri" w:cs="Calibri" w:eastAsia="Calibri" w:hAnsi="Calibri"/>
+          <w:sz w:val="22"/>
+          <w:szCs w:val="22"/>
+        </w:rPr>
+        <w:t xml:space="preserve">3 minutos</w:t>
+      </w:r>
+    </w:p>
+    <w:p>
+      <w:r>
+        <w:br w:type="page"/>
+      </w:r>
+    </w:p>
+    <w:p>
+      <w:pPr>
+        <w:spacing w:before="240" w:after="120"/>
+      </w:pPr>
+      <w:r>
+        <w:rPr>
+          <w:rFonts w:ascii="Calibri" w:cs="Calibri" w:eastAsia="Calibri" w:hAnsi="Calibri"/>
+          <w:b/>
+          <w:bCs/>
+          <w:color w:val="0D9A76"/>
+          <w:sz w:val="32"/>
+          <w:szCs w:val="32"/>
+        </w:rPr>
+        <w:t xml:space="preserve">Diapositiva 16: Escenarios — Que Hago Si...?</w:t>
       </w:r>
     </w:p>
     <w:p>
@@ -3410,7 +3785,7 @@
           <w:sz w:val="32"/>
           <w:szCs w:val="32"/>
         </w:rPr>
-        <w:t xml:space="preserve">Diapositiva 16: Tus Obligaciones como Empleado</w:t>
+        <w:t xml:space="preserve">Diapositiva 17: Tus Obligaciones como Empleado</w:t>
       </w:r>
     </w:p>
     <w:p>
@@ -3656,7 +4031,7 @@
           <w:sz w:val="32"/>
           <w:szCs w:val="32"/>
         </w:rPr>
-        <w:t xml:space="preserve">Diapositiva 17: Evidencias y Auditoria</w:t>
+        <w:t xml:space="preserve">Diapositiva 18: Evidencias y Auditoria</w:t>
       </w:r>
     </w:p>
     <w:p>
@@ -3835,7 +4210,7 @@
           <w:sz w:val="32"/>
           <w:szCs w:val="32"/>
         </w:rPr>
-        <w:t xml:space="preserve">Diapositiva 18: Plan de Concienciacion 2026</w:t>
+        <w:t xml:space="preserve">Diapositiva 19: Plan de Concienciacion 2026</w:t>
       </w:r>
     </w:p>
     <w:p>
@@ -4014,7 +4389,7 @@
           <w:sz w:val="32"/>
           <w:szCs w:val="32"/>
         </w:rPr>
-        <w:t xml:space="preserve">Diapositiva 19: Recursos y Contactos</w:t>
+        <w:t xml:space="preserve">Diapositiva 20: Recursos y Contactos</w:t>
       </w:r>
     </w:p>
     <w:p>
@@ -4046,7 +4421,7 @@
           <w:sz w:val="22"/>
           <w:szCs w:val="22"/>
         </w:rPr>
-        <w:t xml:space="preserve">Confluence ENSCORP: Nuestra base de conocimiento viva. Toda la documentacion, procedimientos y SOPs estan disponibles alli.</w:t>
+        <w:t xml:space="preserve">BOE — RD 311/2022: Texto completo del Esquema Nacional de Seguridad en boe.es (https://www.boe.es/buscar/act.php?id=BOE-A-2022-7191).</w:t>
       </w:r>
     </w:p>
     <w:p>
@@ -4163,7 +4538,7 @@
           <w:sz w:val="22"/>
           <w:szCs w:val="22"/>
         </w:rPr>
-        <w:t xml:space="preserve">Proporcionar nombres y emails concretos si es apropiado para la organizacion. Enfatizar que el canal de comunicacion para incidentes esta siempre abierto.</w:t>
+        <w:t xml:space="preserve">El enlace al BOE permite consultar el texto legal completo del ENS (RD 311/2022). Proporcionar nombres y emails concretos si es apropiado. Enfatizar que el canal de comunicacion para incidentes esta siempre abierto.</w:t>
       </w:r>
     </w:p>
     <w:p>
@@ -4211,7 +4586,7 @@
           <w:sz w:val="32"/>
           <w:szCs w:val="32"/>
         </w:rPr>
-        <w:t xml:space="preserve">Diapositiva 20: Preguntas y Cierre</w:t>
+        <w:t xml:space="preserve">Diapositiva 21: Preguntas y Cierre</w:t>
       </w:r>
     </w:p>
     <w:p>

</xml_diff>

<commit_message>
feat: update presentation files for ENS team in DOCX and PPTX formats
</commit_message>
<xml_diff>
--- a/08_GOBERNANZA/Presentacion ENS equipo optimTech.docx
+++ b/08_GOBERNANZA/Presentacion ENS equipo optimTech.docx
@@ -484,6 +484,116 @@
           </w:p>
         </w:tc>
       </w:tr>
+      <w:tr>
+        <w:tc>
+          <w:tcPr>
+            <w:tcW w:type="dxa" w:w="1500"/>
+            <w:tcBorders>
+              <w:top w:val="single" w:color="D9D9D9" w:sz="1"/>
+              <w:left w:val="single" w:color="D9D9D9" w:sz="1"/>
+              <w:bottom w:val="single" w:color="D9D9D9" w:sz="1"/>
+              <w:right w:val="single" w:color="D9D9D9" w:sz="1"/>
+            </w:tcBorders>
+            <w:vAlign w:val="center"/>
+          </w:tcPr>
+          <w:p>
+            <w:pPr>
+              <w:spacing w:before="40" w:after="40"/>
+            </w:pPr>
+            <w:r>
+              <w:rPr>
+                <w:rFonts w:ascii="Calibri" w:cs="Calibri" w:eastAsia="Calibri" w:hAnsi="Calibri"/>
+                <w:b w:val="false"/>
+                <w:bCs w:val="false"/>
+                <w:sz w:val="22"/>
+                <w:szCs w:val="22"/>
+              </w:rPr>
+              <w:t xml:space="preserve">08/03/2026</w:t>
+            </w:r>
+          </w:p>
+        </w:tc>
+        <w:tc>
+          <w:tcPr>
+            <w:tcW w:type="dxa" w:w="1000"/>
+            <w:tcBorders>
+              <w:top w:val="single" w:color="D9D9D9" w:sz="1"/>
+              <w:left w:val="single" w:color="D9D9D9" w:sz="1"/>
+              <w:bottom w:val="single" w:color="D9D9D9" w:sz="1"/>
+              <w:right w:val="single" w:color="D9D9D9" w:sz="1"/>
+            </w:tcBorders>
+            <w:vAlign w:val="center"/>
+          </w:tcPr>
+          <w:p>
+            <w:pPr>
+              <w:spacing w:before="40" w:after="40"/>
+            </w:pPr>
+            <w:r>
+              <w:rPr>
+                <w:rFonts w:ascii="Calibri" w:cs="Calibri" w:eastAsia="Calibri" w:hAnsi="Calibri"/>
+                <w:b w:val="false"/>
+                <w:bCs w:val="false"/>
+                <w:sz w:val="22"/>
+                <w:szCs w:val="22"/>
+              </w:rPr>
+              <w:t xml:space="preserve">1.2</w:t>
+            </w:r>
+          </w:p>
+        </w:tc>
+        <w:tc>
+          <w:tcPr>
+            <w:tcW w:type="dxa" w:w="4400"/>
+            <w:tcBorders>
+              <w:top w:val="single" w:color="D9D9D9" w:sz="1"/>
+              <w:left w:val="single" w:color="D9D9D9" w:sz="1"/>
+              <w:bottom w:val="single" w:color="D9D9D9" w:sz="1"/>
+              <w:right w:val="single" w:color="D9D9D9" w:sz="1"/>
+            </w:tcBorders>
+            <w:vAlign w:val="center"/>
+          </w:tcPr>
+          <w:p>
+            <w:pPr>
+              <w:spacing w:before="40" w:after="40"/>
+            </w:pPr>
+            <w:r>
+              <w:rPr>
+                <w:rFonts w:ascii="Calibri" w:cs="Calibri" w:eastAsia="Calibri" w:hAnsi="Calibri"/>
+                <w:b w:val="false"/>
+                <w:bCs w:val="false"/>
+                <w:sz w:val="22"/>
+                <w:szCs w:val="22"/>
+              </w:rPr>
+              <w:t xml:space="preserve">Añadido slide de guía JSM para equipos no-TIC</w:t>
+            </w:r>
+          </w:p>
+        </w:tc>
+        <w:tc>
+          <w:tcPr>
+            <w:tcW w:type="dxa" w:w="1500"/>
+            <w:tcBorders>
+              <w:top w:val="single" w:color="D9D9D9" w:sz="1"/>
+              <w:left w:val="single" w:color="D9D9D9" w:sz="1"/>
+              <w:bottom w:val="single" w:color="D9D9D9" w:sz="1"/>
+              <w:right w:val="single" w:color="D9D9D9" w:sz="1"/>
+            </w:tcBorders>
+            <w:vAlign w:val="center"/>
+          </w:tcPr>
+          <w:p>
+            <w:pPr>
+              <w:spacing w:before="40" w:after="40"/>
+            </w:pPr>
+            <w:r>
+              <w:rPr>
+                <w:rFonts w:ascii="Calibri" w:cs="Calibri" w:eastAsia="Calibri" w:hAnsi="Calibri"/>
+                <w:b w:val="false"/>
+                <w:bCs w:val="false"/>
+                <w:sz w:val="22"/>
+                <w:szCs w:val="22"/>
+              </w:rPr>
+              <w:t xml:space="preserve">CTO</w:t>
+            </w:r>
+          </w:p>
+        </w:tc>
+      </w:tr>
     </w:tbl>
     <w:p>
       <w:r>
@@ -3393,7 +3503,424 @@
           <w:sz w:val="32"/>
           <w:szCs w:val="32"/>
         </w:rPr>
-        <w:t xml:space="preserve">Diapositiva 16: Escenarios — Que Hago Si...?</w:t>
+        <w:t xml:space="preserve">Diapositiva 16: ¿Cuando uso Jira Service Management (JSM)?</w:t>
+      </w:r>
+    </w:p>
+    <w:p>
+      <w:pPr>
+        <w:spacing w:before="200" w:after="100"/>
+      </w:pPr>
+      <w:r>
+        <w:rPr>
+          <w:rFonts w:ascii="Calibri" w:cs="Calibri" w:eastAsia="Calibri" w:hAnsi="Calibri"/>
+          <w:color w:val="0D9A76"/>
+          <w:sz w:val="26"/>
+          <w:szCs w:val="26"/>
+        </w:rPr>
+        <w:t xml:space="preserve">Contenido de la Diapositiva</w:t>
+      </w:r>
+    </w:p>
+    <w:p>
+      <w:pPr>
+        <w:spacing w:after="120"/>
+      </w:pPr>
+      <w:r>
+        <w:rPr>
+          <w:rFonts w:ascii="Calibri" w:cs="Calibri" w:eastAsia="Calibri" w:hAnsi="Calibri"/>
+          <w:sz w:val="22"/>
+          <w:szCs w:val="22"/>
+        </w:rPr>
+        <w:t xml:space="preserve">Tabla/matriz con dos columnas:</w:t>
+      </w:r>
+    </w:p>
+    <w:tbl>
+      <w:tblPr>
+        <w:tblW w:type="dxa" w:w="8400"/>
+        <w:tblBorders>
+          <w:top w:val="single" w:color="D9D9D9" w:sz="1"/>
+          <w:left w:val="single" w:color="D9D9D9" w:sz="1"/>
+          <w:bottom w:val="single" w:color="D9D9D9" w:sz="1"/>
+          <w:right w:val="single" w:color="D9D9D9" w:sz="1"/>
+          <w:insideH w:val="single" w:color="D9D9D9" w:sz="1"/>
+          <w:insideV w:val="single" w:color="D9D9D9" w:sz="1"/>
+        </w:tblBorders>
+      </w:tblPr>
+      <w:tblGrid>
+        <w:gridCol w:w="4200"/>
+        <w:gridCol w:w="4200"/>
+      </w:tblGrid>
+      <w:tr>
+        <w:tc>
+          <w:tcPr>
+            <w:tcW w:type="dxa" w:w="4200"/>
+            <w:shd w:val="clear" w:color="auto" w:fill="0D9A76"/>
+          </w:tcPr>
+          <w:p>
+            <w:pPr>
+              <w:spacing w:before="40" w:after="40"/>
+            </w:pPr>
+            <w:r>
+              <w:rPr>
+                <w:rFonts w:ascii="Calibri" w:cs="Calibri" w:eastAsia="Calibri" w:hAnsi="Calibri"/>
+                <w:b/>
+                <w:bCs/>
+                <w:color w:val="FFFFFF"/>
+                <w:sz w:val="22"/>
+                <w:szCs w:val="22"/>
+              </w:rPr>
+              <w:t xml:space="preserve">✅ Usa JSM cuando...</w:t>
+            </w:r>
+          </w:p>
+        </w:tc>
+        <w:tc>
+          <w:tcPr>
+            <w:tcW w:type="dxa" w:w="4200"/>
+            <w:shd w:val="clear" w:color="auto" w:fill="C53030"/>
+          </w:tcPr>
+          <w:p>
+            <w:pPr>
+              <w:spacing w:before="40" w:after="40"/>
+            </w:pPr>
+            <w:r>
+              <w:rPr>
+                <w:rFonts w:ascii="Calibri" w:cs="Calibri" w:eastAsia="Calibri" w:hAnsi="Calibri"/>
+                <w:b/>
+                <w:bCs/>
+                <w:color w:val="FFFFFF"/>
+                <w:sz w:val="22"/>
+                <w:szCs w:val="22"/>
+              </w:rPr>
+              <w:t xml:space="preserve">❌ NO necesitas JSM para...</w:t>
+            </w:r>
+          </w:p>
+        </w:tc>
+      </w:tr>
+      <w:tr>
+        <w:tc>
+          <w:tcPr>
+            <w:tcW w:type="dxa" w:w="4200"/>
+          </w:tcPr>
+          <w:p>
+            <w:pPr>
+              <w:spacing w:before="40" w:after="40"/>
+            </w:pPr>
+            <w:r>
+              <w:rPr>
+                <w:rFonts w:ascii="Calibri" w:cs="Calibri" w:eastAsia="Calibri" w:hAnsi="Calibri"/>
+                <w:sz w:val="22"/>
+                <w:szCs w:val="22"/>
+              </w:rPr>
+              <w:t xml:space="preserve">Necesitas acceso a un sistema o herramienta (P04)</w:t>
+            </w:r>
+          </w:p>
+        </w:tc>
+        <w:tc>
+          <w:tcPr>
+            <w:tcW w:type="dxa" w:w="4200"/>
+          </w:tcPr>
+          <w:p>
+            <w:pPr>
+              <w:spacing w:before="40" w:after="40"/>
+            </w:pPr>
+            <w:r>
+              <w:rPr>
+                <w:rFonts w:ascii="Calibri" w:cs="Calibri" w:eastAsia="Calibri" w:hAnsi="Calibri"/>
+                <w:sz w:val="22"/>
+                <w:szCs w:val="22"/>
+              </w:rPr>
+              <w:t xml:space="preserve">Planificar campañas de marketing</w:t>
+            </w:r>
+          </w:p>
+        </w:tc>
+      </w:tr>
+      <w:tr>
+        <w:tc>
+          <w:tcPr>
+            <w:tcW w:type="dxa" w:w="4200"/>
+          </w:tcPr>
+          <w:p>
+            <w:pPr>
+              <w:spacing w:before="40" w:after="40"/>
+            </w:pPr>
+            <w:r>
+              <w:rPr>
+                <w:rFonts w:ascii="Calibri" w:cs="Calibri" w:eastAsia="Calibri" w:hAnsi="Calibri"/>
+                <w:sz w:val="22"/>
+                <w:szCs w:val="22"/>
+              </w:rPr>
+              <w:t xml:space="preserve">Quieres incorporar una herramienta nueva (P03)</w:t>
+            </w:r>
+          </w:p>
+        </w:tc>
+        <w:tc>
+          <w:tcPr>
+            <w:tcW w:type="dxa" w:w="4200"/>
+          </w:tcPr>
+          <w:p>
+            <w:pPr>
+              <w:spacing w:before="40" w:after="40"/>
+            </w:pPr>
+            <w:r>
+              <w:rPr>
+                <w:rFonts w:ascii="Calibri" w:cs="Calibri" w:eastAsia="Calibri" w:hAnsi="Calibri"/>
+                <w:sz w:val="22"/>
+                <w:szCs w:val="22"/>
+              </w:rPr>
+              <w:t xml:space="preserve">Reuniones comerciales con clientes</w:t>
+            </w:r>
+          </w:p>
+        </w:tc>
+      </w:tr>
+      <w:tr>
+        <w:tc>
+          <w:tcPr>
+            <w:tcW w:type="dxa" w:w="4200"/>
+          </w:tcPr>
+          <w:p>
+            <w:pPr>
+              <w:spacing w:before="40" w:after="40"/>
+            </w:pPr>
+            <w:r>
+              <w:rPr>
+                <w:rFonts w:ascii="Calibri" w:cs="Calibri" w:eastAsia="Calibri" w:hAnsi="Calibri"/>
+                <w:sz w:val="22"/>
+                <w:szCs w:val="22"/>
+              </w:rPr>
+              <w:t xml:space="preserve">Detectas un posible incidente de seguridad (P05)</w:t>
+            </w:r>
+          </w:p>
+        </w:tc>
+        <w:tc>
+          <w:tcPr>
+            <w:tcW w:type="dxa" w:w="4200"/>
+          </w:tcPr>
+          <w:p>
+            <w:pPr>
+              <w:spacing w:before="40" w:after="40"/>
+            </w:pPr>
+            <w:r>
+              <w:rPr>
+                <w:rFonts w:ascii="Calibri" w:cs="Calibri" w:eastAsia="Calibri" w:hAnsi="Calibri"/>
+                <w:sz w:val="22"/>
+                <w:szCs w:val="22"/>
+              </w:rPr>
+              <w:t xml:space="preserve">Gestion de leads y oportunidades (usa CRM)</w:t>
+            </w:r>
+          </w:p>
+        </w:tc>
+      </w:tr>
+      <w:tr>
+        <w:tc>
+          <w:tcPr>
+            <w:tcW w:type="dxa" w:w="4200"/>
+          </w:tcPr>
+          <w:p>
+            <w:pPr>
+              <w:spacing w:before="40" w:after="40"/>
+            </w:pPr>
+            <w:r>
+              <w:rPr>
+                <w:rFonts w:ascii="Calibri" w:cs="Calibri" w:eastAsia="Calibri" w:hAnsi="Calibri"/>
+                <w:sz w:val="22"/>
+                <w:szCs w:val="22"/>
+              </w:rPr>
+              <w:t xml:space="preserve">Necesitas dar de alta/baja un usuario (P04)</w:t>
+            </w:r>
+          </w:p>
+        </w:tc>
+        <w:tc>
+          <w:tcPr>
+            <w:tcW w:type="dxa" w:w="4200"/>
+          </w:tcPr>
+          <w:p>
+            <w:pPr>
+              <w:spacing w:before="40" w:after="40"/>
+            </w:pPr>
+            <w:r>
+              <w:rPr>
+                <w:rFonts w:ascii="Calibri" w:cs="Calibri" w:eastAsia="Calibri" w:hAnsi="Calibri"/>
+                <w:sz w:val="22"/>
+                <w:szCs w:val="22"/>
+              </w:rPr>
+              <w:t xml:space="preserve">Crear materiales de marketing</w:t>
+            </w:r>
+          </w:p>
+        </w:tc>
+      </w:tr>
+      <w:tr>
+        <w:tc>
+          <w:tcPr>
+            <w:tcW w:type="dxa" w:w="4200"/>
+          </w:tcPr>
+          <w:p>
+            <w:pPr>
+              <w:spacing w:before="40" w:after="40"/>
+            </w:pPr>
+            <w:r>
+              <w:rPr>
+                <w:rFonts w:ascii="Calibri" w:cs="Calibri" w:eastAsia="Calibri" w:hAnsi="Calibri"/>
+                <w:sz w:val="22"/>
+                <w:szCs w:val="22"/>
+              </w:rPr>
+              <w:t xml:space="preserve">Solicitas un cambio en infraestructura TIC (P03)</w:t>
+            </w:r>
+          </w:p>
+        </w:tc>
+        <w:tc>
+          <w:tcPr>
+            <w:tcW w:type="dxa" w:w="4200"/>
+          </w:tcPr>
+          <w:p>
+            <w:pPr>
+              <w:spacing w:before="40" w:after="40"/>
+            </w:pPr>
+            <w:r>
+              <w:rPr>
+                <w:rFonts w:ascii="Calibri" w:cs="Calibri" w:eastAsia="Calibri" w:hAnsi="Calibri"/>
+                <w:sz w:val="22"/>
+                <w:szCs w:val="22"/>
+              </w:rPr>
+              <w:t xml:space="preserve">Trabajo operativo diario de tu equipo</w:t>
+            </w:r>
+          </w:p>
+        </w:tc>
+      </w:tr>
+      <w:tr>
+        <w:tc>
+          <w:tcPr>
+            <w:tcW w:type="dxa" w:w="4200"/>
+          </w:tcPr>
+          <w:p>
+            <w:pPr>
+              <w:spacing w:before="40" w:after="40"/>
+            </w:pPr>
+            <w:r>
+              <w:rPr>
+                <w:rFonts w:ascii="Calibri" w:cs="Calibri" w:eastAsia="Calibri" w:hAnsi="Calibri"/>
+                <w:sz w:val="22"/>
+                <w:szCs w:val="22"/>
+              </w:rPr>
+              <w:t xml:space="preserve">Un proveedor necesita acceso a sistemas</w:t>
+            </w:r>
+          </w:p>
+        </w:tc>
+        <w:tc>
+          <w:tcPr>
+            <w:tcW w:type="dxa" w:w="4200"/>
+          </w:tcPr>
+          <w:p>
+            <w:pPr>
+              <w:spacing w:before="40" w:after="40"/>
+            </w:pPr>
+            <w:r>
+              <w:rPr>
+                <w:rFonts w:ascii="Calibri" w:cs="Calibri" w:eastAsia="Calibri" w:hAnsi="Calibri"/>
+                <w:sz w:val="22"/>
+                <w:szCs w:val="22"/>
+              </w:rPr>
+              <w:t xml:space="preserve">Coordinacion interna de proyectos (usa Jira)</w:t>
+            </w:r>
+          </w:p>
+        </w:tc>
+      </w:tr>
+    </w:tbl>
+    <w:p>
+      <w:pPr>
+        <w:spacing w:before="200" w:after="120"/>
+      </w:pPr>
+      <w:r>
+        <w:rPr>
+          <w:rFonts w:ascii="Calibri" w:cs="Calibri" w:eastAsia="Calibri" w:hAnsi="Calibri"/>
+          <w:b/>
+          <w:bCs/>
+          <w:color w:val="0D9A76"/>
+          <w:sz w:val="22"/>
+          <w:szCs w:val="22"/>
+        </w:rPr>
+        <w:t xml:space="preserve">Mensaje clave: </w:t>
+      </w:r>
+      <w:r>
+        <w:rPr>
+          <w:rFonts w:ascii="Calibri" w:cs="Calibri" w:eastAsia="Calibri" w:hAnsi="Calibri"/>
+          <w:sz w:val="22"/>
+          <w:szCs w:val="22"/>
+        </w:rPr>
+        <w:t xml:space="preserve">“JSM es el punto de entrada para todo lo que afecte a sistemas, accesos o seguridad. Para tu trabajo operativo diario, usa las herramientas de tu equipo (Jira, CRM, etc.)”</w:t>
+      </w:r>
+    </w:p>
+    <w:p>
+      <w:pPr>
+        <w:spacing w:before="200" w:after="100"/>
+      </w:pPr>
+      <w:r>
+        <w:rPr>
+          <w:rFonts w:ascii="Calibri" w:cs="Calibri" w:eastAsia="Calibri" w:hAnsi="Calibri"/>
+          <w:color w:val="0D9A76"/>
+          <w:sz w:val="26"/>
+          <w:szCs w:val="26"/>
+        </w:rPr>
+        <w:t xml:space="preserve">Notas del Presentador</w:t>
+      </w:r>
+    </w:p>
+    <w:p>
+      <w:pPr>
+        <w:spacing w:after="120"/>
+      </w:pPr>
+      <w:r>
+        <w:rPr>
+          <w:rFonts w:ascii="Calibri" w:cs="Calibri" w:eastAsia="Calibri" w:hAnsi="Calibri"/>
+          <w:sz w:val="22"/>
+          <w:szCs w:val="22"/>
+        </w:rPr>
+        <w:t xml:space="preserve">Tiempo estimado: 3 minutos. Enfatizar que JSM no es burocracia sino trazabilidad. Poner ejemplos concretos del equipo de marketing/ventas: “Si necesitais acceso a HubSpot, eso va por JSM. Si estais planificando una campaña, eso es vuestro Jira de equipo.” Recordar que ante cualquier duda, siempre pueden preguntar al CISO.</w:t>
+      </w:r>
+    </w:p>
+    <w:p>
+      <w:pPr>
+        <w:spacing w:before="200" w:after="100"/>
+      </w:pPr>
+      <w:r>
+        <w:rPr>
+          <w:rFonts w:ascii="Calibri" w:cs="Calibri" w:eastAsia="Calibri" w:hAnsi="Calibri"/>
+          <w:color w:val="0D9A76"/>
+          <w:sz w:val="26"/>
+          <w:szCs w:val="26"/>
+        </w:rPr>
+        <w:t xml:space="preserve">Tiempo Estimado</w:t>
+      </w:r>
+    </w:p>
+    <w:p>
+      <w:pPr>
+        <w:spacing w:after="120"/>
+      </w:pPr>
+      <w:r>
+        <w:rPr>
+          <w:rFonts w:ascii="Calibri" w:cs="Calibri" w:eastAsia="Calibri" w:hAnsi="Calibri"/>
+          <w:sz w:val="22"/>
+          <w:szCs w:val="22"/>
+        </w:rPr>
+        <w:t xml:space="preserve">3 minutos</w:t>
+      </w:r>
+    </w:p>
+    <w:p>
+      <w:r>
+        <w:br w:type="page"/>
+      </w:r>
+    </w:p>
+    <w:p>
+      <w:pPr>
+        <w:spacing w:before="240" w:after="120"/>
+      </w:pPr>
+      <w:r>
+        <w:rPr>
+          <w:rFonts w:ascii="Calibri" w:cs="Calibri" w:eastAsia="Calibri" w:hAnsi="Calibri"/>
+          <w:b/>
+          <w:bCs/>
+          <w:color w:val="0D9A76"/>
+          <w:sz w:val="32"/>
+          <w:szCs w:val="32"/>
+        </w:rPr>
+        <w:t xml:space="preserve">Diapositiva 17: Escenarios — Que Hago Si...?</w:t>
       </w:r>
     </w:p>
     <w:p>
@@ -3785,7 +4312,7 @@
           <w:sz w:val="32"/>
           <w:szCs w:val="32"/>
         </w:rPr>
-        <w:t xml:space="preserve">Diapositiva 17: Tus Obligaciones como Empleado</w:t>
+        <w:t xml:space="preserve">Diapositiva 18: Tus Obligaciones como Empleado</w:t>
       </w:r>
     </w:p>
     <w:p>
@@ -4031,7 +4558,7 @@
           <w:sz w:val="32"/>
           <w:szCs w:val="32"/>
         </w:rPr>
-        <w:t xml:space="preserve">Diapositiva 18: Evidencias y Auditoria</w:t>
+        <w:t xml:space="preserve">Diapositiva 19: Evidencias y Auditoria</w:t>
       </w:r>
     </w:p>
     <w:p>
@@ -4210,7 +4737,7 @@
           <w:sz w:val="32"/>
           <w:szCs w:val="32"/>
         </w:rPr>
-        <w:t xml:space="preserve">Diapositiva 19: Plan de Concienciacion 2026</w:t>
+        <w:t xml:space="preserve">Diapositiva 20: Plan de Concienciacion 2026</w:t>
       </w:r>
     </w:p>
     <w:p>
@@ -4389,7 +4916,7 @@
           <w:sz w:val="32"/>
           <w:szCs w:val="32"/>
         </w:rPr>
-        <w:t xml:space="preserve">Diapositiva 20: Recursos y Contactos</w:t>
+        <w:t xml:space="preserve">Diapositiva 21: Recursos y Contactos</w:t>
       </w:r>
     </w:p>
     <w:p>
@@ -4586,7 +5113,7 @@
           <w:sz w:val="32"/>
           <w:szCs w:val="32"/>
         </w:rPr>
-        <w:t xml:space="preserve">Diapositiva 21: Preguntas y Cierre</w:t>
+        <w:t xml:space="preserve">Diapositiva 22: Preguntas y Cierre</w:t>
       </w:r>
     </w:p>
     <w:p>

</xml_diff>